<commit_message>
Full cleanup: official email, branding, password, stray files
</commit_message>
<xml_diff>
--- a/css.docx
+++ b/css.docx
@@ -153,55 +153,15 @@
         <w:pStyle w:val="NormalWeb"/>
       </w:pPr>
       <w:r>
-        <w:t xml:space="preserve">make sure with every form and livery is different and check </w:t>
-      </w:r>
-      <w:proofErr w:type="spellStart"/>
-      <w:r>
-        <w:t>dashbord</w:t>
-      </w:r>
-      <w:proofErr w:type="spellEnd"/>
-      <w:r>
-        <w:t xml:space="preserve"> all working and all </w:t>
-      </w:r>
-      <w:proofErr w:type="spellStart"/>
-      <w:r>
-        <w:t>nubers</w:t>
-      </w:r>
-      <w:proofErr w:type="spellEnd"/>
-      <w:r>
-        <w:t xml:space="preserve"> hours showing correctly fix all bugs before give to </w:t>
-      </w:r>
-      <w:proofErr w:type="spellStart"/>
-      <w:r>
-        <w:t>custome</w:t>
-      </w:r>
-      <w:proofErr w:type="spellEnd"/>
-      <w:r>
-        <w:t xml:space="preserve"> make sure about it and in dash bord </w:t>
-      </w:r>
-      <w:proofErr w:type="spellStart"/>
-      <w:r>
-        <w:t>i</w:t>
-      </w:r>
-      <w:proofErr w:type="spellEnd"/>
-      <w:r>
-        <w:t xml:space="preserve"> can see bugs in showing time and prices in booking check </w:t>
-      </w:r>
-      <w:proofErr w:type="spellStart"/>
-      <w:r>
-        <w:t>every thing</w:t>
-      </w:r>
-      <w:proofErr w:type="spellEnd"/>
-      <w:r>
-        <w:t xml:space="preserve"> step by step as pro expert and manage all bookings with correct time and booking also should be perfect and for freezing customer can freeze is you know any time inside 2 month package validity ok and it also show in </w:t>
-      </w:r>
-      <w:proofErr w:type="spellStart"/>
-      <w:r>
-        <w:t>frezz</w:t>
-      </w:r>
-      <w:proofErr w:type="spellEnd"/>
-      <w:r>
-        <w:t xml:space="preserve"> tab when un freeze it go as same to bookings section as normal bookings</w:t>
+        <w:t>make sure with every form and livery is different and check dashbord all working and all nubers hours showing correctly fix all bugs before give to custome make sure about it and in dash bord i can see bugs in showing time and prices in booking check every thing step by step as pro expert and manage all bookings with correct time and booking also should be perfect and for freezing customer can freeze is you know any time inside 2 month package validity ok and it also show in frezz tab when un freeze it go as same to bookings section as normal bookings</w:t>
+      </w:r>
+    </w:p>
+    <w:p>
+      <w:pPr>
+        <w:pStyle w:val="NormalWeb"/>
+      </w:pPr>
+      <w:r>
+        <w:t>ok next this is big one inside private lessons first you can see sessions booking ok nextabout this program and discription i need to chande that like 1 st session booking next class duration and next terms abd regulations after that about this program and discription ok and please change description title to same size as terms and regulations and description to same smaller txt in all pages including livery and all lesson pages</w:t>
       </w:r>
     </w:p>
     <w:p/>

</xml_diff>